<commit_message>
alle screens bis auf Settings fertig
</commit_message>
<xml_diff>
--- a/Protokoll_2.docx
+++ b/Protokoll_2.docx
@@ -21,7 +21,17 @@
           <w:szCs w:val="40"/>
           <w:lang w:val="de-DE"/>
         </w:rPr>
-        <w:t xml:space="preserve">2. </w:t>
+        <w:t>4</w:t>
+      </w:r>
+      <w:r>
+        <w:rPr>
+          <w:b/>
+          <w:bCs/>
+          <w:sz w:val="40"/>
+          <w:szCs w:val="40"/>
+          <w:lang w:val="de-DE"/>
+        </w:rPr>
+        <w:t xml:space="preserve">. </w:t>
       </w:r>
       <w:r>
         <w:rPr>
@@ -77,7 +87,25 @@
         <w:rPr>
           <w:lang w:val="de-DE"/>
         </w:rPr>
-        <w:t xml:space="preserve">Konzeptdokument wurde angenommen </w:t>
+        <w:t>Datenbank/ Server so gut wie fertig</w:t>
+      </w:r>
+    </w:p>
+    <w:p>
+      <w:pPr>
+        <w:pStyle w:val="Listenabsatz"/>
+        <w:numPr>
+          <w:ilvl w:val="0"/>
+          <w:numId w:val="1"/>
+        </w:numPr>
+        <w:rPr>
+          <w:lang w:val="de-DE"/>
+        </w:rPr>
+      </w:pPr>
+      <w:r>
+        <w:rPr>
+          <w:lang w:val="de-DE"/>
+        </w:rPr>
+        <w:t xml:space="preserve">Frontend initialisiert </w:t>
       </w:r>
     </w:p>
     <w:p>
@@ -224,31 +252,7 @@
         <w:rPr>
           <w:lang w:val="de-DE"/>
         </w:rPr>
-        <w:t>Jetzt wieder sehr gut</w:t>
-      </w:r>
-      <w:r>
-        <w:rPr>
-          <w:lang w:val="de-DE"/>
-        </w:rPr>
-        <w:t>.</w:t>
-      </w:r>
-      <w:r>
-        <w:rPr>
-          <w:lang w:val="de-DE"/>
-        </w:rPr>
-        <w:t xml:space="preserve"> Letzte Woche war ich leider krank,</w:t>
-      </w:r>
-      <w:r>
-        <w:rPr>
-          <w:lang w:val="de-DE"/>
-        </w:rPr>
-        <w:t xml:space="preserve"> </w:t>
-      </w:r>
-      <w:r>
-        <w:rPr>
-          <w:lang w:val="de-DE"/>
-        </w:rPr>
-        <w:t xml:space="preserve">aber ich habe den Rückstand wieder aufgeholt. </w:t>
+        <w:t>Gut, jedoch muss ich noch 2 Pages zu Hause erledigen.</w:t>
       </w:r>
     </w:p>
     <w:p>
@@ -279,19 +283,7 @@
     </w:p>
     <w:p>
       <w:r>
-        <w:t>Warten, bis das Projekt von Herrn Kimme</w:t>
-      </w:r>
-      <w:r>
-        <w:t>r</w:t>
-      </w:r>
-      <w:r>
-        <w:t>s</w:t>
-      </w:r>
-      <w:r>
-        <w:t>t</w:t>
-      </w:r>
-      <w:r>
-        <w:t>orfer akzeptiert wird. Danach kann das Coden beginnen.</w:t>
+        <w:t>Die letzten Pages final zu implementieren.</w:t>
       </w:r>
     </w:p>
     <w:p/>
@@ -340,7 +332,31 @@
         <w:rPr>
           <w:lang w:val="de-DE"/>
         </w:rPr>
-        <w:t xml:space="preserve"> verwendet. Zur erzeugen einer Datenbank und als grundlegende Hilfe zum Programmieren.</w:t>
+        <w:t xml:space="preserve"> verwendet. Zur </w:t>
+      </w:r>
+      <w:r>
+        <w:rPr>
+          <w:lang w:val="de-DE"/>
+        </w:rPr>
+        <w:t>Verbesserung</w:t>
+      </w:r>
+      <w:r>
+        <w:rPr>
+          <w:lang w:val="de-DE"/>
+        </w:rPr>
+        <w:t xml:space="preserve"> </w:t>
+      </w:r>
+      <w:r>
+        <w:rPr>
+          <w:lang w:val="de-DE"/>
+        </w:rPr>
+        <w:t xml:space="preserve">meines Servers und </w:t>
+      </w:r>
+      <w:r>
+        <w:rPr>
+          <w:lang w:val="de-DE"/>
+        </w:rPr>
+        <w:t>als grundlegende Hilfe zum Programmieren.</w:t>
       </w:r>
     </w:p>
     <w:p>

</xml_diff>